<commit_message>
sync: align branch tree with upstream main through v26.38.0
</commit_message>
<xml_diff>
--- a/backend/apps/documents/docx_templates/3-归档模板/1-案卷封面.docx
+++ b/backend/apps/documents/docx_templates/3-归档模板/1-案卷封面.docx
@@ -205,21 +205,7 @@
                 <w:szCs w:val="18"/>
                 <w:lang w:val="en-US" w:eastAsia="zh-CN"/>
               </w:rPr>
-              <w:t>{{年份</w:t>
-            </w:r>
-            <w:bookmarkStart w:id="0" w:name="_GoBack"/>
-            <w:bookmarkEnd w:id="0"/>
-            <w:r>
-              <w:rPr>
-                <w:rFonts w:hint="eastAsia" w:ascii="宋体" w:hAnsi="宋体"/>
-                <w:b/>
-                <w:bCs/>
-                <w:color w:val="000000"/>
-                <w:kern w:val="0"/>
-                <w:szCs w:val="18"/>
-                <w:lang w:val="en-US" w:eastAsia="zh-CN"/>
-              </w:rPr>
-              <w:t>}}</w:t>
+              <w:t>{{年份}}</w:t>
             </w:r>
             <w:r>
               <w:rPr>
@@ -347,19 +333,21 @@
                 <w:color w:val="000000"/>
                 <w:kern w:val="0"/>
                 <w:szCs w:val="21"/>
-                <w:lang w:eastAsia="zh-Hans"/>
-              </w:rPr>
-            </w:pPr>
-            <w:r>
-              <w:rPr>
-                <w:rFonts w:hint="default" w:ascii="宋体" w:hAnsi="宋体"/>
+                <w:lang w:val="en-US" w:eastAsia="zh-CN"/>
+              </w:rPr>
+            </w:pPr>
+            <w:r>
+              <w:rPr>
+                <w:rFonts w:hint="eastAsia" w:ascii="宋体" w:hAnsi="宋体"/>
                 <w:color w:val="000000"/>
                 <w:kern w:val="0"/>
                 <w:szCs w:val="21"/>
-                <w:lang w:eastAsia="zh-Hans"/>
-              </w:rPr>
-              <w:t>/</w:t>
-            </w:r>
+                <w:lang w:val="en-US" w:eastAsia="zh-CN"/>
+              </w:rPr>
+              <w:t>{{案由}}</w:t>
+            </w:r>
+            <w:bookmarkStart w:id="0" w:name="_GoBack"/>
+            <w:bookmarkEnd w:id="0"/>
           </w:p>
         </w:tc>
       </w:tr>
@@ -2020,7 +2008,7 @@
                 <w:szCs w:val="2"/>
                 <w:lang w:val="en-US" w:eastAsia="zh-CN"/>
               </w:rPr>
-              <w:t>{{合同类型}}</w:t>
+              <w:t>{{归档合同类型}}</w:t>
             </w:r>
           </w:p>
         </w:tc>

</xml_diff>